<commit_message>
final: self-consistency rerun complete, all numbers regenerated, paper and docs corrected
Co-Authored-By: Claude Opus 5.5 <noreply@anthropic.com>
</commit_message>
<xml_diff>
--- a/Prompting_Technique_Benchmark_Paper.docx
+++ b/Prompting_Technique_Benchmark_Paper.docx
@@ -69,7 +69,7 @@
     </w:p>
     <w:p>
       <w:r>
-        <w:t>This study presents a controlled empirical comparison of eight prompting techniques across five natural language processing tasks, evaluating whether prompting technique effectiveness varies systematically by task type. Using a single open-weight large language model (openai/gpt-oss-20b) under fixed inference settings (temperature 0.0, except self-consistency at 0.7; random seed 42), thirty-eight technique-task combinations were evaluated across sentiment classification (TweetEval), named entity recognition (MultiNERD), abstractive summarisation (XSum), question answering (TriviaQA), and paraphrase detection (GLUE MRPC). Results show that reasoning-oriented techniques — chain-of-thought and self-consistency — do not reliably outperform simpler techniques such as zero-shot, few-shot, or reformulation, despite substantially higher inference cost in the case of self-consistency. Reformulation, which rephrases the task instruction with explicit constraints, was the strongest technique on three of five tasks (named entity recognition, question answering, and paraphrase detection) but the near the bottom on the other two (second-to-last on sentiment classification and last on summarisation ROUGE-L), so its advantage is task-dependent. This suggests that, for tasks with well-defined objectives, instruction clarity may matter more than reasoning depth or demonstration count. The study is scoped to English-language tasks, a single model, and a single random seed. Paired bootstrap 95% confidence intervals show that most differences between techniques within a task are not statistically distinguishable at 100 examples per task, so rankings should be read as indicative rather than definitive. A planned cross-lingual extension to Urdu was scoped during development but is not included in this release.</w:t>
+        <w:t>This study presents a controlled empirical comparison of eight prompting techniques across five natural language processing tasks, evaluating whether prompting technique effectiveness varies systematically by task type. Using a single open-weight large language model (openai/gpt-oss-20b; temperature 0.0, except self-consistency at 0.7; random seed 42), thirty-eight technique-task combinations were evaluated on 100 examples each across sentiment classification (TweetEval), named entity recognition (MultiNERD), abstractive summarisation (XSum), question answering (TriviaQA), and paraphrase detection (GLUE MRPC). No technique reliably dominated. Reformulation, which rephrases the task instruction with explicit constraints, scored highest on three tasks (named entity recognition, question answering, and paraphrase detection) but lowest on the other two (sentiment classification and summarisation). Few-shot chain-of-thought scored highest on sentiment classification and summarisation but lowest on named entity recognition. Zero-shot chain-of-thought and self-consistency did not score highest on any task, although self-consistency costs three model calls per example. Most differences are within sampling noise: paired bootstrap 95% confidence intervals distinguish only 7 of the 33 comparisons between each task's top-scoring technique and the others, and on no task is the top technique distinguishable from the runner-up. The rankings should therefore be read as indicative rather than definitive. The study is limited to English-language tasks, a single model, and a single random seed; a planned extension to Urdu is not included in this release.</w:t>
       </w:r>
     </w:p>
     <w:p>
@@ -92,12 +92,12 @@
     </w:p>
     <w:p>
       <w:r>
-        <w:t>This study addresses that gap directly. The research question is: does the effectiveness of prompting techniques vary systematically by task type, and if so, do more elaborate, reasoning-oriented techniques reliably outperform simpler ones? To answer this, eight prompting techniques — zero-shot, few-shot, chain-of-thought, role prompting, reformulation, self-consistency, structured output, and few-shot chain-of-thought — were evaluated on five distinct NLP tasks under identical model, inference, and evaluation conditions: sentiment classification, named entity recognition, abstractive summarisation, question answering, and paraphrase detection.</w:t>
+        <w:t>This study addresses that gap directly. The research question is: does the effectiveness of prompting techniques vary systematically by task type, and if so, do more elaborate, reasoning-oriented techniques reliably outperform simpler ones? To answer this, eight prompting techniques — zero-shot, few-shot, chain-of-thought, role prompting, reformulation, self-consistency, structured output, and few-shot chain-of-thought — were evaluated on five distinct NLP tasks under the same model and evaluation conditions, with the inference-setting exceptions noted in Limitations: sentiment classification, named entity recognition, abstractive summarisation, question answering, and paraphrase detection.</w:t>
       </w:r>
     </w:p>
     <w:p>
       <w:r>
-        <w:t>The contribution of this work is a controlled, single-model, eight-technique by five-task comparison conducted under matched conditions, with every result traceable to a specific model, prompt template version, and random seed, and every reported metric independently recomputable from preserved raw model outputs. Rather than proposing a new prompting technique, this study asks a more fundamental question for practitioners: given a fixed model and a fixed task, which existing technique is worth using, and does the answer depend on the task?</w:t>
+        <w:t>The contribution of this work is a controlled, single-model, eight-technique by five-task comparison conducted under the same model and evaluation conditions, with every result traceable to a specific model, prompt template version, and random seed, and every reported metric independently recomputable from preserved raw model outputs. Rather than proposing a new prompting technique, this study asks a more fundamental question for practitioners: given a fixed model and a fixed task, which existing technique is worth using, and does the answer depend on the task?</w:t>
       </w:r>
     </w:p>
     <w:p>
@@ -110,7 +110,7 @@
     </w:p>
     <w:p>
       <w:r>
-        <w:t>Liu et al. (2023) provide a comprehensive survey of prompting methods in natural language processing, cataloguing a wide range of prompting strategies and their reported applications. Notably, the survey identifies systematic cross-task comparison of prompting techniques as an open gap in the literature, along with cross-lingual prompting as an underexplored direction. This study directly addresses the first of these two gaps by evaluating the same eight techniques across five distinct task types under matched conditions; the second gap — cross-lingual evaluation — was scoped during development but is not addressed in this release (see Limitations).</w:t>
+        <w:t>Liu et al. (2023) provide a comprehensive survey of prompting methods in natural language processing, cataloguing a wide range of prompting strategies and their reported applications. Notably, the survey identifies systematic cross-task comparison of prompting techniques as an open gap in the literature, along with cross-lingual prompting as an underexplored direction. This study directly addresses the first of these two gaps by evaluating the same eight techniques across five distinct task types under the same model and evaluation conditions; the second gap — cross-lingual evaluation — was scoped during development but is not addressed in this release (see Limitations).</w:t>
       </w:r>
     </w:p>
     <w:p>
@@ -146,7 +146,7 @@
     </w:p>
     <w:p>
       <w:r>
-        <w:t>All experiments used openai/gpt-oss-20b, accessed via Groq's inference API. Temperature was fixed at 0.0 for all techniques except self-consistency, which used temperature 0.7, as in Wang et al. (2023), with three samples per input. Wang et al. used up to 40 sampled paths, so this is a cost-constrained configuration that may understate the technique's benefit. A single random seed (42) was fixed across all experiments, including dataset sampling and few-shot demonstration selection, to ensure reproducibility.</w:t>
+        <w:t>All experiments used openai/gpt-oss-20b, accessed via Groq's inference API. Temperature was fixed at 0.0 for all techniques except self-consistency, which used temperature 0.7, as in Wang et al. (2023), with three samples per input. Wang et al. used up to 40 sampled paths, so this is a cost-constrained configuration that may understate the technique's benefit. A single random seed (42) was fixed across all experiments, including dataset sampling and few-shot demonstration selection, to ensure reproducibility; the only exception is that self-consistency's three samples use seeds 42, 43 and 44, so that they are drawn independently.</w:t>
       </w:r>
     </w:p>
     <w:p>
@@ -243,7 +243,7 @@
         <w:t xml:space="preserve">Self-consistency — </w:t>
       </w:r>
       <w:r>
-        <w:t>three samples generated at temperature 0.7, aggregated by majority vote, following Wang et al. (2023); excluded from question answering and summarisation, where majority voting over free-text generation is undefined.</w:t>
+        <w:t>three samples generated at temperature 0.7, each with its own random seed, aggregated by majority vote, following Wang et al. (2023); excluded from question answering and summarisation, where majority voting over free-text generation is undefined.</w:t>
       </w:r>
     </w:p>
     <w:p>
@@ -606,7 +606,7 @@
     </w:p>
     <w:p>
       <w:r>
-        <w:t>The evaluation pipeline underwent iterative internal audit throughout development. Measurement validity — including metric computation correctness, prompt template consistency, and demonstration-sampling integrity — was verified before final results were generated. Every reported result is traceable to a specific model name, prompt template version, normaliser version, and random seed, recorded per experiment; raw model predictions for every example are preserved, allowing every reported metric to be independently recomputed from source data.</w:t>
+        <w:t>The evaluation pipeline underwent iterative internal audit throughout development. Measurement validity — including metric computation correctness, prompt template consistency, and demonstration-sampling integrity — was verified iteratively during data collection; corrections made after some results existed are disclosed in Limitations. Every reported result is traceable to a specific model name, prompt template version, normaliser version, and random seed, recorded per experiment; raw model predictions for every example are preserved, allowing every reported metric to be independently recomputed from source data.</w:t>
       </w:r>
     </w:p>
     <w:p>
@@ -619,7 +619,7 @@
     </w:p>
     <w:p>
       <w:r>
-        <w:t>Thirty-eight of thirty-eight planned English-language experiments were completed (eight techniques across five tasks, with self-consistency excluded from question answering and summarisation). Tables 1 through 5 report the complete results for each task. "Flagged" indicates the number of examples, out of 100, for which a parse failure occurred and the prediction was counted as incorrect.</w:t>
+        <w:t>Thirty-eight of thirty-eight planned English-language experiments were completed (eight techniques across five tasks, with self-consistency excluded from question answering and summarisation). Tables 1 through 5 report the complete results for each task. Techniques are ranked by the task's primary metric; techniques with identical scores are listed alphabetically. "Flagged" indicates the number of examples, out of 100, for which a parse failure occurred and the prediction was counted as incorrect. The 95% confidence intervals come from the paired bootstrap described in Section 4.6.</w:t>
       </w:r>
     </w:p>
     <w:p>
@@ -955,6 +955,48 @@
           </w:tcPr>
           <w:p>
             <w:r>
+              <w:t>Self-consistency</w:t>
+            </w:r>
+          </w:p>
+        </w:tc>
+        <w:tc>
+          <w:tcPr>
+            <w:tcW w:type="dxa" w:w="2340"/>
+          </w:tcPr>
+          <w:p>
+            <w:r>
+              <w:t>0.6309</w:t>
+            </w:r>
+          </w:p>
+        </w:tc>
+        <w:tc>
+          <w:tcPr>
+            <w:tcW w:type="dxa" w:w="2340"/>
+          </w:tcPr>
+          <w:p>
+            <w:r>
+              <w:t>0.535–0.721</w:t>
+            </w:r>
+          </w:p>
+        </w:tc>
+        <w:tc>
+          <w:tcPr>
+            <w:tcW w:type="dxa" w:w="2340"/>
+          </w:tcPr>
+          <w:p>
+            <w:r>
+              <w:t>0</w:t>
+            </w:r>
+          </w:p>
+        </w:tc>
+      </w:tr>
+      <w:tr>
+        <w:tc>
+          <w:tcPr>
+            <w:tcW w:type="dxa" w:w="2340"/>
+          </w:tcPr>
+          <w:p>
+            <w:r>
               <w:t>Reformulation</w:t>
             </w:r>
           </w:p>
@@ -990,53 +1032,11 @@
           </w:p>
         </w:tc>
       </w:tr>
-      <w:tr>
-        <w:tc>
-          <w:tcPr>
-            <w:tcW w:type="dxa" w:w="2340"/>
-          </w:tcPr>
-          <w:p>
-            <w:r>
-              <w:t>Self-consistency</w:t>
-            </w:r>
-          </w:p>
-        </w:tc>
-        <w:tc>
-          <w:tcPr>
-            <w:tcW w:type="dxa" w:w="2340"/>
-          </w:tcPr>
-          <w:p>
-            <w:r>
-              <w:t>0.6015</w:t>
-            </w:r>
-          </w:p>
-        </w:tc>
-        <w:tc>
-          <w:tcPr>
-            <w:tcW w:type="dxa" w:w="2340"/>
-          </w:tcPr>
-          <w:p>
-            <w:r>
-              <w:t>0.499–0.693</w:t>
-            </w:r>
-          </w:p>
-        </w:tc>
-        <w:tc>
-          <w:tcPr>
-            <w:tcW w:type="dxa" w:w="2340"/>
-          </w:tcPr>
-          <w:p>
-            <w:r>
-              <w:t>0</w:t>
-            </w:r>
-          </w:p>
-        </w:tc>
-      </w:tr>
     </w:tbl>
     <w:p/>
     <w:p>
       <w:r>
-        <w:t>Combining demonstrations with reasoning (few-shot CoT) produced the strongest result. CoT alone did not outperform zero-shot, suggesting explicit reasoning adds limited value for sentiment classification without accompanying examples. Self-consistency, despite requiring three times the inference cost, underperformed simple zero-shot prompting.</w:t>
+        <w:t>Few-shot CoT, which combines demonstrations with reasoning, scored highest (0.7159), but its lead over few-shot prompting (0.6924) is within sampling noise; the bootstrap distinguishes it only from self-consistency and reformulation (Section 4.6). CoT alone (0.6577) scored slightly below zero-shot (0.6663). Self-consistency, despite three model calls per example, scored below zero-shot (0.6309), and reformulation scored lowest of the eight techniques (0.6047).</w:t>
       </w:r>
     </w:p>
     <w:p>
@@ -1204,48 +1204,6 @@
           </w:tcPr>
           <w:p>
             <w:r>
-              <w:t>Self-consistency</w:t>
-            </w:r>
-          </w:p>
-        </w:tc>
-        <w:tc>
-          <w:tcPr>
-            <w:tcW w:type="dxa" w:w="2340"/>
-          </w:tcPr>
-          <w:p>
-            <w:r>
-              <w:t>0.7539</w:t>
-            </w:r>
-          </w:p>
-        </w:tc>
-        <w:tc>
-          <w:tcPr>
-            <w:tcW w:type="dxa" w:w="2340"/>
-          </w:tcPr>
-          <w:p>
-            <w:r>
-              <w:t>0.693–0.810</w:t>
-            </w:r>
-          </w:p>
-        </w:tc>
-        <w:tc>
-          <w:tcPr>
-            <w:tcW w:type="dxa" w:w="2340"/>
-          </w:tcPr>
-          <w:p>
-            <w:r>
-              <w:t>0</w:t>
-            </w:r>
-          </w:p>
-        </w:tc>
-      </w:tr>
-      <w:tr>
-        <w:tc>
-          <w:tcPr>
-            <w:tcW w:type="dxa" w:w="2340"/>
-          </w:tcPr>
-          <w:p>
-            <w:r>
               <w:t>CoT</w:t>
             </w:r>
           </w:p>
@@ -1319,6 +1277,48 @@
           <w:p>
             <w:r>
               <w:t>2</w:t>
+            </w:r>
+          </w:p>
+        </w:tc>
+      </w:tr>
+      <w:tr>
+        <w:tc>
+          <w:tcPr>
+            <w:tcW w:type="dxa" w:w="2340"/>
+          </w:tcPr>
+          <w:p>
+            <w:r>
+              <w:t>Self-consistency</w:t>
+            </w:r>
+          </w:p>
+        </w:tc>
+        <w:tc>
+          <w:tcPr>
+            <w:tcW w:type="dxa" w:w="2340"/>
+          </w:tcPr>
+          <w:p>
+            <w:r>
+              <w:t>0.7500</w:t>
+            </w:r>
+          </w:p>
+        </w:tc>
+        <w:tc>
+          <w:tcPr>
+            <w:tcW w:type="dxa" w:w="2340"/>
+          </w:tcPr>
+          <w:p>
+            <w:r>
+              <w:t>0.682–0.808</w:t>
+            </w:r>
+          </w:p>
+        </w:tc>
+        <w:tc>
+          <w:tcPr>
+            <w:tcW w:type="dxa" w:w="2340"/>
+          </w:tcPr>
+          <w:p>
+            <w:r>
+              <w:t>0</w:t>
             </w:r>
           </w:p>
         </w:tc>
@@ -1453,7 +1453,7 @@
     <w:p/>
     <w:p>
       <w:r>
-        <w:t>Performance clustered tightly across most techniques (0.75-0.77), with few-shot CoT as a notable underperformer — the combination of demonstrations and reasoning appears to introduce noise for extraction tasks rather than improving precision.</w:t>
+        <w:t>Seven of the eight techniques scored between 0.748 and 0.769. Reformulation scored highest despite four flagged examples, but its lead over few-shot prompting is within sampling noise. Self-consistency and zero-shot tied at exactly 0.7500. Few-shot CoT scored lowest (0.6957) and is the only technique the bootstrap distinguishes from reformulation; one possible reading is that combining demonstrations with reasoning added noise to entity extraction rather than improving precision.</w:t>
       </w:r>
     </w:p>
     <w:p>
@@ -1912,7 +1912,7 @@
     <w:p/>
     <w:p>
       <w:r>
-        <w:t>All techniques scored well below the fine-tuned PEGASUS baseline (approximately 0.40 ROUGE-L), consistent with expectations for zero/few-shot prompting versus fine-tuned models. Scores clustered closely across techniques, suggesting prompting strategy has limited impact on abstractive summarisation quality relative to the underlying model's capability.</w:t>
+        <w:t>All techniques scored well below the fine-tuned PEGASUS baseline (approximately 0.40 ROUGE-L), consistent with expectations for zero/few-shot prompting versus fine-tuned models. All seven techniques fell within 0.010 ROUGE-L of each other (0.1709 to 0.1801), suggesting that prompting strategy has limited impact on summarisation scores relative to the underlying model's capability. Few-shot CoT ranked first on ROUGE-L, 0.0001 ahead of structured output, while zero-shot had the highest BERTScore; reformulation was lowest on both metrics. These metrics also do not detect factual errors in the summaries (see Limitations).</w:t>
       </w:r>
     </w:p>
     <w:p>
@@ -2371,7 +2371,7 @@
     <w:p/>
     <w:p>
       <w:r>
-        <w:t>Reformulation performed best on QA, suggesting that rephrasing the instruction with explicit constraints helps the model produce more precise short-answer outputs. Reasoning-based techniques (CoT, few-shot CoT) did not outperform simpler approaches on this closed-book factual QA task.</w:t>
+        <w:t>Reformulation scored highest on exact match (0.59) and token F1, four percentage points ahead of few-shot, role and structured output (0.55 each); this lead is within sampling noise, and the bootstrap distinguishes reformulation only from zero-shot (0.51), which scored lowest. CoT (0.53) and few-shot CoT (0.52) scored below few-shot, role and structured output on this closed-book factual task, and above zero-shot.</w:t>
       </w:r>
     </w:p>
     <w:p>
@@ -2549,7 +2549,7 @@
           </w:tcPr>
           <w:p>
             <w:r>
-              <w:t>0.7143</w:t>
+              <w:t>0.7270</w:t>
             </w:r>
           </w:p>
         </w:tc>
@@ -2559,7 +2559,7 @@
           </w:tcPr>
           <w:p>
             <w:r>
-              <w:t>0.616–0.802</w:t>
+              <w:t>0.635–0.816</w:t>
             </w:r>
           </w:p>
         </w:tc>
@@ -2788,7 +2788,7 @@
     <w:p/>
     <w:p>
       <w:r>
-        <w:t>Reformulation again performed best, reinforcing a pattern across tasks: explicit rephrasing of the instruction outperforms both minimal prompting and reasoning-heavy techniques for binary classification-style judgments, though this did not extend to sentiment classification, the other classification task, where reformulation ranked second-to-last.</w:t>
+        <w:t>Reformulation scored highest on paraphrase detection (0.7472), followed by role prompting (0.7335) and self-consistency (0.7270), but its lead over role prompting is within sampling noise. Structured output (0.6495) and CoT (0.6464) scored lowest, and these are the only two techniques the bootstrap distinguishes from reformulation. Reformulation's result did not carry over to sentiment classification, the other classification task, where it scored lowest.</w:t>
       </w:r>
     </w:p>
     <w:p>
@@ -2801,17 +2801,17 @@
     </w:p>
     <w:p>
       <w:r>
-        <w:t>Across all five tasks, a consistent pattern emerges: elaborate reasoning-oriented techniques (chain-of-thought, self-consistency) do not reliably outperform simpler techniques (zero-shot, few-shot, reformulation) on this model, and in several cases underperform despite substantially higher computational cost. Self-consistency, which requires three times the inference calls, was never the best-performing technique on any task, and was the lowest-scoring technique on sentiment classification (0.6015, narrowly below reformulation at 0.6047). Reformulation — simply rephrasing the instruction with explicit constraints — was the strongest technique on three of five tasks (NER, QA, paraphrase detection) but near the bottom on the other two (second-to-last on sentiment classification and last on summarisation ROUGE-L), so its advantage is task-dependent.</w:t>
+        <w:t>No technique reliably dominated across the five tasks, and most differences are within sampling noise. The top-scoring technique changed with the task: reformulation on named entity recognition, question answering and paraphrase detection, and few-shot CoT on sentiment classification and summarisation (ROUGE-L). Each of these two techniques also scored lowest somewhere: reformulation on sentiment classification and on both summarisation metrics, and few-shot CoT on named entity recognition. Zero-shot CoT never scored highest, and ranked last on paraphrase detection. Self-consistency, which requires three model calls per example, never scored highest: it ranked seventh of eight on sentiment classification, tied with zero-shot in the middle of the named entity recognition table, and third of eight on paraphrase detection. Simple prompting was competitive throughout: few-shot prompting ranked second on sentiment classification, named entity recognition and question answering (tied on question answering), and zero-shot had the highest summarisation BERTScore.</w:t>
       </w:r>
     </w:p>
     <w:p>
       <w:r>
-        <w:t>These rankings carry substantial uncertainty. A paired bootstrap (1,000 resamples of the 100 examples per task, with every technique scored on the same resampled examples) found that only 8 of the 33 comparisons between each task's best technique and the others were statistically distinguishable at the 95% level: few-shot CoT over reformulation and self-consistency on sentiment classification; reformulation over structured output and CoT on paraphrase detection, over few-shot CoT on named entity recognition, and over zero-shot on question answering; and few-shot CoT over CoT on summarisation, by a margin of 0.0001 at the lower bound. Reformulation's lead over the second-ranked technique was not statistically distinguishable on any of the three tasks it led. No correction for multiple comparisons was applied, so even these eight differences should be read cautiously. Full intervals are in outputs/tables/bootstrap_ci.csv.</w:t>
+        <w:t>These rankings carry substantial uncertainty. A paired bootstrap (1,000 resamples of the 100 examples per task, with every technique scored on the same resampled examples) compared each task's top-scoring technique with each of the others, 33 comparisons in all. Only 7 were distinguishable at the 95% level: few-shot CoT over self-consistency and over reformulation on sentiment classification; reformulation over few-shot CoT on named entity recognition; few-shot CoT over CoT on summarisation, with a lower bound of 0.0001; reformulation over zero-shot on question answering; and reformulation over structured output and over CoT on paraphrase detection. On no task was the top-scoring technique distinguishable from the runner-up; in particular, reformulation's lead was not distinguishable on any of the three tasks it led. No correction for multiple comparisons was applied, so even these seven differences should be read cautiously. Full intervals are provided with the project materials.</w:t>
       </w:r>
     </w:p>
     <w:p>
       <w:r>
-        <w:t>This suggests that for tasks with well-defined, unambiguous objectives, prompt clarity and instruction precision may matter more than reasoning depth or demonstration count — a finding that has practical implications for practitioners choosing prompting strategies under compute or latency constraints.</w:t>
+        <w:t>Read together, the results are consistent with the possibility that, for tasks with well-defined objectives, a clearly specified instruction matters as much as reasoning depth or demonstration count. They do not establish this, because the leading technique's advantage is never distinguishable from the runner-up and it reverses on other tasks.</w:t>
       </w:r>
     </w:p>
     <w:p>
@@ -2824,22 +2824,22 @@
     </w:p>
     <w:p>
       <w:r>
-        <w:t>Reasoning-oriented techniques did not consistently outperform simpler alternatives. Zero-shot CoT never ranked first on any task, and few-shot CoT ranked first on sentiment and summarisation (ROUGE-L) but last on NER. This mixed pattern invites explanation. One plausible interpretation is that chain-of-thought and self-consistency were designed and validated primarily on tasks requiring multi-step deductive or arithmetic reasoning — domains in which an intermediate reasoning trace can meaningfully constrain and improve the final answer. The five tasks evaluated here, by contrast, are largely tasks with a single well-defined correct answer that does not require multi-step derivation: classifying the sentiment of a sentence, extracting named entities, or identifying a paraphrase pair does not obviously benefit from an intermediate reasoning trace in the way that a multi-step arithmetic problem does. Wei et al. (2022) and Kojima et al. (2022) both validated their respective techniques exclusively on reasoning benchmarks; the results here do not contradict their findings so much as they clarify the boundary of where those findings apply — chain-of-thought's benefit appears to be conditional on task structure rather than universal.</w:t>
+        <w:t>Reasoning-oriented techniques did not consistently outperform simpler alternatives. Zero-shot CoT never ranked first on any task, and few-shot CoT ranked first on sentiment classification and summarisation (ROUGE-L) but last on named entity recognition. This mixed pattern invites explanation. One plausible interpretation is that chain-of-thought and self-consistency were designed and validated primarily on tasks requiring multi-step deductive or arithmetic reasoning, where an intermediate reasoning trace can meaningfully constrain and improve the final answer. The five tasks evaluated here are largely tasks with a single well-defined answer that does not require multi-step derivation: classifying the sentiment of a sentence, extracting named entities, or identifying a paraphrase pair does not obviously benefit from an intermediate reasoning trace in the way that a multi-step arithmetic problem does. A second, model-specific factor is that gpt-oss-20b already reasons internally before every answer, which likely narrows the room for an explicit reasoning instruction to help (see Limitations). Wei et al. (2022) and Kojima et al. (2022) validated their techniques on reasoning benchmarks; the results here do not contradict their findings so much as suggest that chain-of-thought's benefit depends on the task and the model.</w:t>
       </w:r>
     </w:p>
     <w:p>
       <w:r>
-        <w:t>The performance of reformulation is a more direct point of interest. Reformulation was the strongest technique on three of five tasks (named entity recognition, question answering, and paraphrase detection) but near the bottom on the other two (second-to-last on sentiment classification and last on summarisation ROUGE-L), so its advantage is task-dependent. Where it led, it required no demonstrations, no additional sampling, and no reasoning trace — only a rephrased instruction with explicit output constraints. A plausible explanation is that many of the failures observed with other techniques were less about the model's underlying task capability and more about output ambiguity: an explicit, tightly constrained instruction may reduce the model's uncertainty about what form its answer should take, independent of whether the model reasons about the task at all. This is consistent with the observation that reformulation's advantage was strongest on QA and paraphrase detection — tasks where the correct output format (a short factual answer; a binary label) is easy to specify precisely, but where free-form model responses can otherwise drift into hedged, verbose, or ambiguously formatted answers.</w:t>
+        <w:t>Reformulation is the most uneven technique in this study. It scored highest on named entity recognition, question answering and paraphrase detection, but lowest on sentiment classification and on both summarisation metrics, and none of its leads is distinguishable from the runner-up. Where it led, it required no demonstrations, no additional sampling, and no reasoning trace, only a rephrased instruction with explicit output constraints. One possible explanation is that some failures of other techniques stem from output ambiguity rather than from the model's task capability: an explicit, tightly constrained instruction may reduce uncertainty about what form the answer should take. Its largest margin was on question answering, where the expected output (a short factual answer) is easy to specify precisely. Its weak results on sentiment classification and summarisation show that the same kind of rewording can also hurt, so this explanation remains a hypothesis rather than a finding.</w:t>
       </w:r>
     </w:p>
     <w:p>
       <w:r>
-        <w:t>This finding also complicates a straightforward reading of Wang et al. (2023): self-consistency, despite requiring three times the inference cost of a single-sample technique, was never the best-performing technique on any of the five tasks evaluated here, and was the lowest-scoring technique on sentiment classification. Because self-consistency was validated by its original authors on mathematical reasoning tasks where multiple independent reasoning paths can meaningfully disagree and be resolved by majority vote, its lack of benefit here is consistent with the same task-structure explanation offered above — majority voting over three samples offers limited value when the underlying source of error is not reasoning inconsistency but instruction ambiguity or output formatting variance.</w:t>
+        <w:t>These results also complicate a straightforward reading of Wang et al. (2023). Self-consistency, despite requiring three model calls per example, never scored highest: it ranked seventh of eight on sentiment classification, tied with zero-shot on named entity recognition, and third on paraphrase detection. Two explanations are possible, and this study cannot separate them. The first is task structure: majority voting over three samples offers limited value when errors come from instruction ambiguity or output formatting rather than from inconsistent reasoning, and the three samples agreed on most examples (82 of 100 on sentiment classification, 70 on named entity recognition, 86 on paraphrase detection). The second is temperature: self-consistency samples at temperature 0.7, while every other technique runs at 0.0, so each individual sample is noisier than a single greedy answer, and voting over only three samples may not recover that loss. Wang et al. used up to 40 samples, so this three-sample configuration may understate the technique's benefit.</w:t>
       </w:r>
     </w:p>
     <w:p>
       <w:r>
-        <w:t>Taken together, these results suggest a practical heuristic: for tasks with a well-defined, unambiguous objective, practitioners may achieve better results, at lower inference cost, by investing effort in instruction clarity rather than adopting the most sophisticated or most expensive available technique. This heuristic is offered cautiously, as a pattern observed under a single model, single seed, and five tasks, rather than a general theoretical claim.</w:t>
+        <w:t>Taken together, these results support cautious, task-specific advice rather than a single recommendation. Under a fixed model, the choice of technique changed the score on each task, but by margins that 100 examples per task mostly cannot resolve, and the technique that led on one task was often among the weakest on another. Practitioners should therefore test a small set of inexpensive candidates, such as zero-shot, few-shot and a reformulated instruction, on their own task before paying for more expensive techniques. This advice is offered as a pattern observed under a single model, a single seed and five tasks, not as a general claim.</w:t>
       </w:r>
     </w:p>
     <w:p>
@@ -2862,22 +2862,32 @@
     </w:p>
     <w:p>
       <w:r>
-        <w:t>Seven of the thirteen question-answering and summarisation results (zero-shot, few-shot, role and structured output on QA; zero-shot, few-shot and structured output on summarisation) were generated prior to the tuning of a reasoning-efficiency inference setting, finalised on 2026-07-28. One of these seven results was independently re-verified from raw model output and confirmed accurate; the remaining six were not individually re-checked, though no quality issues were observed in this group during review. This is disclosed here rather than silently corrected, in keeping with this study's broader commitment to auditable, traceable results.</w:t>
+        <w:t>Model and inference caveats. openai/gpt-oss-20b is a reasoning model: before its visible answer it produces hidden internal reasoning, and these hidden reasoning tokens count against the output-token limit. Every technique, including zero-shot, therefore involves some internal reasoning, which likely narrows the measurable benefit of explicit chain-of-thought prompting. It is also the main source of parse failures: 21 of the 30 failures in the reported results reached the output-token limit (1,500 tokens for sentiment, named entity recognition and paraphrase detection; 1,000 for question answering and summarisation), 20 of them with no visible answer at all. Of the other failures, six are structured-output summaries that did not close the required answer tag and three were caused by network errors rather than by the model. All failures are scored as incorrect.</w:t>
       </w:r>
     </w:p>
     <w:p>
       <w:r>
-        <w:t>The BERTScore metric used for summarisation evaluation uses a bert-base-uncased backbone; absolute BERTScore values should be treated as indicative rather than calibrated against stronger, more recent backbone models.</w:t>
+        <w:t>To limit truncation, question answering and summarisation were run with the provider's reasoning-effort setting set to low, while the other three tasks used the provider's default. This setting was introduced on 2026-07-28, after seven of the thirteen question-answering and summarisation results had been generated (zero-shot, few-shot, role and structured output on question answering; structured output, zero-shot and few-shot on summarisation), so comparisons within those two tasks span two inference configurations. One of these seven results was independently re-verified from raw model output; the other six were not individually re-checked.</w:t>
       </w:r>
     </w:p>
     <w:p>
       <w:r>
-        <w:t>Model and inference caveats. openai/gpt-oss-20b is a reasoning model that produces hidden internal reasoning before its visible answer. These reasoning tokens count against the generation limit. As a result, every technique, including zero-shot, involves some internal reasoning, which likely narrows the measurable benefit of explicit chain-of-thought prompting. It is also the most likely cause of the truncated, empty responses that make up 21 of the 30 remaining parse failures. To limit truncation, question answering and summarisation were run with the provider's reasoning_effort parameter set to "low", while the other three tasks used the provider default. Seven of the thirteen QA and summarisation results were generated before this setting was introduced, so comparisons within those two tasks span two inference configurations. Examples that failed to parse were individually re-queried: 70 re-queries were logged during data collection, of which 47 produced a valid answer, and all remaining failures are scored as incorrect. Re-queries were not applied uniformly across techniques, so flagged counts should not be compared directly between techniques. Re-queries of self-consistency examples were repeated using the full three-sample majority vote. One example that had already produced a valid answer and was re-queried in error has been restored to its original prediction. Three failures caused by network errors rather than model output are also scored as incorrect. BERTScore values are rescaled against the bert-base-uncased baseline (rescale_with_baseline=True), which is why they fall around 0.30 rather than the roughly 0.85 typical of unrescaled scores.</w:t>
+        <w:t>Corrections during data collection. Examples that failed to parse were individually re-queried, and this was not done evenly across techniques. The reported results include 46 re-queries of 44 examples: zero-shot 24 examples, few-shot CoT 9, CoT 6, reformulation 3, role prompting 1, structured output 1, and few-shot and self-consistency none. Of the 42 re-queried examples that had failed, 37 now have a valid answer and 5 remain failed. Flagged counts should therefore not be compared directly between techniques. Three re-queries were applied to examples that already had a valid answer: two returned the same answer, and one (example 48, CoT on sentiment) returned a different answer and has been restored to its original prediction. A further 34 logged re-queries (19 for self-consistency, 13 for zero-shot and 2 for few-shot CoT on question answering) belong to runs that were later discarded and regenerated in full, and do not affect any reported result. Finally, on 2026-07-28 the question-answering templates for CoT and few-shot CoT were edited to add a brevity instruction without a change to the template version number. Both of these results were regenerated in full on 2026-07-29, so every reported result uses the edited wording, but the version label alone does not distinguish the two wordings.</w:t>
       </w:r>
     </w:p>
     <w:p>
       <w:r>
-        <w:t>Paraphrase detection is reported using macro F1, consistent with this study's evaluation convention across all classification tasks, rather than GLUE's official binary-F1 convention. As a result, paraphrase scores reported here are not directly comparable to the public MRPC leaderboard without conversion.</w:t>
+        <w:t>Self-consistency was regenerated in full. An audit found that its three samples per example had been sent with the same random seed; in the original sentiment run the three samples gave the same answer on 97 of the 99 examples for which all three were logged. All three self-consistency results reported here were regenerated with seeds 42, 43 and 44 for the three samples, and API or network errors during the regeneration were retried rather than scored as failures. After regeneration the three samples agreed on 82 of 100 sentiment examples, 70 of 100 named entity recognition examples and 86 of 100 paraphrase examples. On paraphrase detection, agreement was about as high before the change (87 of 98 logged examples), so the high agreement reflects the model's own consistency at temperature 0.7 and not only the shared seed.</w:t>
+      </w:r>
+    </w:p>
+    <w:p>
+      <w:r>
+        <w:t>Metric conventions. Sentiment and paraphrase scores are macro F1. TweetEval's official sentiment metric is macro-averaged recall, and GLUE reports binary F1 for MRPC, so these scores are not directly comparable to either public leaderboard. BERTScore uses a bert-base-uncased backbone and is rescaled against a baseline, which is why its values fall around 0.30 rather than the roughly 0.85 typical of unrescaled scores; absolute BERTScore values should be treated as indicative.</w:t>
+      </w:r>
+    </w:p>
+    <w:p>
+      <w:r>
+        <w:t>Summarisation metrics do not detect factual errors. ROUGE-L and BERTScore measure overlap and similarity with a reference summary, so a fluent summary that states a wrong fact is not penalised. An informal manual check of a few summaries found names that the source article does not support. One article refers to the athlete Sanya Richards-Ross only by her surname; six of the seven techniques (all except few-shot CoT) called her "Emma", the first name of the journalist who interviewed her. Johnny Manziel, also named only by surname, was called "Robert", the first name of a lawyer quoted in the same article, by few-shot and structured output. Derek McInnes was called "Jim" by CoT and structured output, and the CoT summary of an article about David Cameron referred to "Prime Minister Boris Cameron". The check was not systematic, so how often such errors occur is not known.</w:t>
       </w:r>
     </w:p>
     <w:p>
@@ -2895,17 +2905,17 @@
     </w:p>
     <w:p>
       <w:r>
-        <w:t>This study evaluated eight prompting techniques across five NLP tasks under matched model and inference conditions, addressing a gap in the literature around systematic cross-task comparison of prompting strategies. The central finding is that reasoning-oriented techniques — chain-of-thought and self-consistency — do not reliably outperform simpler techniques, and in several cases underperform despite meaningfully higher inference cost; self-consistency, which requires three times the inference calls of a single-sample technique, was never the best-performing technique on any of the five tasks evaluated. Reformulation, one of the simplest and cheapest techniques evaluated, was the strongest technique on three of five tasks (named entity recognition, question answering, and paraphrase detection) but near the bottom on the other two (second-to-last on sentiment classification and last on summarisation ROUGE-L), so its advantage is task-dependent, suggesting that instruction clarity may matter more than reasoning depth or demonstration count for tasks with well-defined objectives.</w:t>
+        <w:t>This study evaluated eight prompting techniques across five English NLP tasks with one model, addressing a gap in the literature around systematic cross-task comparison of prompting strategies. The central finding is that no technique reliably dominated and that most differences between techniques are within sampling noise at 100 examples per task. Reasoning-oriented techniques did not reliably outperform simpler ones: zero-shot chain-of-thought never scored highest, few-shot chain-of-thought scored highest on two tasks but lowest on a third, and self-consistency, at three model calls per example, never scored highest. Reformulation, one of the simplest techniques, scored highest on three tasks (named entity recognition, question answering and paraphrase detection) but lowest on the other two (sentiment classification and summarisation), and none of its leads is statistically distinguishable from the runner-up.</w:t>
       </w:r>
     </w:p>
     <w:p>
       <w:r>
-        <w:t>Future work should extend this comparison along two directions: completing the cross-lingual arm of this study, for which Urdu datasets have already been processed but prompt templates and experiments remain outstanding, and strengthening the statistical evidence — larger evaluation sets, multi-seed replication, and additional models — since the bootstrap intervals reported here cannot separate most techniques at 100 examples per task.</w:t>
+        <w:t>Future work should extend this comparison in two directions: completing the cross-lingual arm of this study, for which Urdu datasets have already been processed but prompt templates and experiments remain outstanding, and strengthening the statistical evidence, through larger evaluation sets, multi-seed replication and additional models, since the bootstrap intervals reported here cannot separate most techniques at 100 examples per task.</w:t>
       </w:r>
     </w:p>
     <w:p>
       <w:r>
-        <w:t>For practitioners choosing a prompting strategy under real-world cost or latency constraints, these results offer a concrete, if provisional, recommendation: a carefully reformulated instruction is worth including among the candidates tested; it was the best technique on three tasks but near the bottom on the other two, so it should be validated per task rather than adopted by default.</w:t>
+        <w:t>For practitioners choosing a prompting strategy under cost or latency constraints, the practical lesson is to validate on the task at hand rather than adopt any technique by default. Inexpensive options (zero-shot, few-shot and a carefully reformulated instruction) were competitive with the more elaborate techniques here, but which of them did best depended on the task.</w:t>
       </w:r>
     </w:p>
     <w:p>

</xml_diff>